<commit_message>
Publish the current build
Synced by support/platform/publish_site.py, which checks the site against data/outputs before and after.
</commit_message>
<xml_diff>
--- a/PV2_Workflow_Documentation.docx
+++ b/PV2_Workflow_Documentation.docx
@@ -565,7 +565,7 @@
           <w:b w:val="0"/>
           <w:sz w:val="23"/>
         </w:rPr>
-        <w:t xml:space="preserve">, 70 Python files in eight subpackages, 23,317 lines (appendix A, which </w:t>
+        <w:t xml:space="preserve">, 70 Python files in eight subpackages, 23,377 lines (appendix A, which </w:t>
       </w:r>
       <w:r>
         <w:rPr>
@@ -9186,7 +9186,7 @@
                 <w:b w:val="0"/>
                 <w:sz w:val="19"/>
               </w:rPr>
-              <w:t>4,975</w:t>
+              <w:t>5,035</w:t>
             </w:r>
           </w:p>
         </w:tc>
@@ -9251,7 +9251,7 @@
                 <w:b w:val="0"/>
                 <w:sz w:val="19"/>
               </w:rPr>
-              <w:t>23,317</w:t>
+              <w:t>23,377</w:t>
             </w:r>
           </w:p>
         </w:tc>
@@ -9316,7 +9316,7 @@
                 <w:b w:val="0"/>
                 <w:sz w:val="19"/>
               </w:rPr>
-              <w:t>3,116</w:t>
+              <w:t>3,147</w:t>
             </w:r>
           </w:p>
         </w:tc>

</xml_diff>